<commit_message>
Improve student lab workflow, standalone archives and report templates
</commit_message>
<xml_diff>
--- a/public/reports/LAB01_template.docx
+++ b/public/reports/LAB01_template.docx
@@ -1898,84 +1898,225 @@
     </w:p>
     <w:p>
       <w:pPr>
-        <w:pStyle w:val="1"/>
-        <w:keepNext/>
+        <w:pStyle w:val="a5"/>
+        <w:pageBreakBefore/>
+        <w:spacing w:after="140"/>
       </w:pPr>
       <w:r>
         <w:rPr>
-          <w:rFonts w:ascii="Times New Roman" w:hAnsi="Times New Roman" w:eastAsia="Times New Roman" w:cs="Times New Roman"/>
           <w:sz w:val="24"/>
           <w:szCs w:val="24"/>
-          <w:b/>
-          <w:color w:val="000000"/>
+          <w:rFonts w:ascii="Times New Roman" w:hAnsi="Times New Roman" w:cs="Times New Roman" w:eastAsia="Times New Roman"/>
         </w:rPr>
-        <w:t>Паспорт лабораторной работы</w:t>
+        <w:t>Лабораторная работа 01</w:t>
+      </w:r>
+    </w:p>
+    <w:p>
+      <w:pPr>
+        <w:pStyle w:val="1"/>
+        <w:spacing w:after="140"/>
+      </w:pPr>
+      <w:r>
+        <w:rPr>
+          <w:sz w:val="24"/>
+          <w:szCs w:val="24"/>
+          <w:rFonts w:ascii="Times New Roman" w:hAnsi="Times New Roman" w:cs="Times New Roman" w:eastAsia="Times New Roman"/>
+        </w:rPr>
+        <w:t>Описание предметной области</w:t>
+      </w:r>
+    </w:p>
+    <w:p>
+      <w:pPr>
+        <w:spacing w:after="140"/>
+      </w:pPr>
+      <w:r>
+        <w:rPr>
+          <w:sz w:val="24"/>
+          <w:szCs w:val="24"/>
+          <w:rFonts w:ascii="Times New Roman" w:hAnsi="Times New Roman" w:cs="Times New Roman" w:eastAsia="Times New Roman"/>
+        </w:rPr>
+        <w:t>Результат работы — описание процесса и таблица участников.</w:t>
+      </w:r>
+    </w:p>
+    <w:p>
+      <w:pPr>
+        <w:spacing w:after="140"/>
+      </w:pPr>
+      <w:r>
+        <w:rPr>
+          <w:sz w:val="24"/>
+          <w:szCs w:val="24"/>
+          <w:rFonts w:ascii="Times New Roman" w:hAnsi="Times New Roman" w:cs="Times New Roman" w:eastAsia="Times New Roman"/>
+        </w:rPr>
+        <w:t>Семестр 1    Максимум 25 баллов</w:t>
+      </w:r>
+    </w:p>
+    <w:p>
+      <w:pPr>
+        <w:spacing w:after="140"/>
+      </w:pPr>
+      <w:r>
+        <w:rPr>
+          <w:sz w:val="24"/>
+          <w:szCs w:val="24"/>
+          <w:rFonts w:ascii="Times New Roman" w:hAnsi="Times New Roman" w:cs="Times New Roman" w:eastAsia="Times New Roman"/>
+        </w:rPr>
+        <w:t>Вариант __________    Предметная область _________________________</w:t>
+      </w:r>
+    </w:p>
+    <w:p>
+      <w:pPr>
+        <w:spacing w:after="140"/>
+      </w:pPr>
+      <w:r>
+        <w:rPr>
+          <w:i/>
+          <w:color w:val="555555"/>
+          <w:sz w:val="24"/>
+          <w:szCs w:val="24"/>
+          <w:rFonts w:ascii="Times New Roman" w:hAnsi="Times New Roman" w:cs="Times New Roman" w:eastAsia="Times New Roman"/>
+        </w:rPr>
+        <w:t>Откройте Начните_здесь.html и CSV из папки Данные. Заполняйте поля по шагам. Серые подсказки удалите перед сдачей. Добавляйте строки при необходимости, сохраняя шрифт 12 пт.</w:t>
+      </w:r>
+    </w:p>
+    <w:p>
+      <w:pPr>
+        <w:pStyle w:val="1"/>
+        <w:spacing w:after="140"/>
+      </w:pPr>
+      <w:r>
+        <w:rPr>
+          <w:sz w:val="24"/>
+          <w:szCs w:val="24"/>
+          <w:rFonts w:ascii="Times New Roman" w:hAnsi="Times New Roman" w:cs="Times New Roman" w:eastAsia="Times New Roman"/>
+        </w:rPr>
+        <w:t>Шаг 1 Опишите процесс</w:t>
+      </w:r>
+    </w:p>
+    <w:p>
+      <w:pPr>
+        <w:spacing w:after="140"/>
+      </w:pPr>
+      <w:r>
+        <w:rPr>
+          <w:i/>
+          <w:color w:val="555555"/>
+          <w:sz w:val="24"/>
+          <w:szCs w:val="24"/>
+          <w:rFonts w:ascii="Times New Roman" w:hAnsi="Times New Roman" w:cs="Times New Roman" w:eastAsia="Times New Roman"/>
+        </w:rPr>
+        <w:t>Напишите 3–5 предложений: цель, участники и результат процесса.</w:t>
+      </w:r>
+    </w:p>
+    <w:p>
+      <w:pPr>
+        <w:pStyle w:val="2"/>
+        <w:spacing w:after="140"/>
+      </w:pPr>
+      <w:r>
+        <w:rPr>
+          <w:sz w:val="24"/>
+          <w:szCs w:val="24"/>
+          <w:rFonts w:ascii="Times New Roman" w:hAnsi="Times New Roman" w:cs="Times New Roman" w:eastAsia="Times New Roman"/>
+        </w:rPr>
+        <w:t>Описание процесса</w:t>
+      </w:r>
+    </w:p>
+    <w:p>
+      <w:pPr>
+        <w:spacing w:after="140"/>
+      </w:pPr>
+      <w:r>
+        <w:rPr>
+          <w:sz w:val="24"/>
+          <w:szCs w:val="24"/>
+          <w:rFonts w:ascii="Times New Roman" w:hAnsi="Times New Roman" w:cs="Times New Roman" w:eastAsia="Times New Roman"/>
+        </w:rPr>
+        <w:t>________________________________________________________________</w:t>
+      </w:r>
+    </w:p>
+    <w:p>
+      <w:pPr>
+        <w:spacing w:after="140"/>
+      </w:pPr>
+      <w:r>
+        <w:rPr>
+          <w:sz w:val="24"/>
+          <w:szCs w:val="24"/>
+          <w:rFonts w:ascii="Times New Roman" w:hAnsi="Times New Roman" w:cs="Times New Roman" w:eastAsia="Times New Roman"/>
+        </w:rPr>
+        <w:t>________________________________________________________________</w:t>
+      </w:r>
+    </w:p>
+    <w:p>
+      <w:pPr>
+        <w:spacing w:after="140"/>
+      </w:pPr>
+      <w:r>
+        <w:rPr>
+          <w:sz w:val="24"/>
+          <w:szCs w:val="24"/>
+          <w:rFonts w:ascii="Times New Roman" w:hAnsi="Times New Roman" w:cs="Times New Roman" w:eastAsia="Times New Roman"/>
+        </w:rPr>
+        <w:t>________________________________________________________________</w:t>
+      </w:r>
+    </w:p>
+    <w:p>
+      <w:pPr>
+        <w:pStyle w:val="1"/>
+        <w:spacing w:after="140"/>
+      </w:pPr>
+      <w:r>
+        <w:rPr>
+          <w:sz w:val="24"/>
+          <w:szCs w:val="24"/>
+          <w:rFonts w:ascii="Times New Roman" w:hAnsi="Times New Roman" w:cs="Times New Roman" w:eastAsia="Times New Roman"/>
+        </w:rPr>
+        <w:t>Шаг 2 Заполните таблицу участников</w:t>
+      </w:r>
+    </w:p>
+    <w:p>
+      <w:pPr>
+        <w:spacing w:after="140"/>
+      </w:pPr>
+      <w:r>
+        <w:rPr>
+          <w:i/>
+          <w:color w:val="555555"/>
+          <w:sz w:val="24"/>
+          <w:szCs w:val="24"/>
+          <w:rFonts w:ascii="Times New Roman" w:hAnsi="Times New Roman" w:cs="Times New Roman" w:eastAsia="Times New Roman"/>
+        </w:rPr>
+        <w:t>В каждой строке укажите одного участника и его действие.</w:t>
       </w:r>
     </w:p>
     <w:tbl>
       <w:tblPr>
         <w:tblW w:type="auto" w:w="0"/>
+        <w:jc w:val="center"/>
         <w:tblLayout w:type="fixed"/>
         <w:tblLook w:firstColumn="1" w:firstRow="1" w:lastColumn="0" w:lastRow="0" w:noHBand="0" w:noVBand="1" w:val="04A0"/>
       </w:tblPr>
       <w:tblGrid>
-        <w:gridCol w:w="2268"/>
-        <w:gridCol w:w="7087"/>
+        <w:gridCol w:w="2835"/>
+        <w:gridCol w:w="6520"/>
       </w:tblGrid>
       <w:tr>
+        <w:trPr>
+          <w:cantSplit/>
+          <w:tblHeader/>
+        </w:trPr>
         <w:tc>
           <w:tcPr>
-            <w:tcW w:type="dxa" w:w="2268"/>
-            <w:tcBorders>
-              <w:top w:val="single" w:sz="4" w:color="D9D9D9"/>
-              <w:left w:val="single" w:sz="4" w:color="D9D9D9"/>
-              <w:bottom w:val="single" w:sz="4" w:color="D9D9D9"/>
-              <w:right w:val="single" w:sz="4" w:color="D9D9D9"/>
-            </w:tcBorders>
-            <w:shd w:fill="E7E6E6"/>
-          </w:tcPr>
-          <w:p>
-            <w:r>
-              <w:rPr>
-                <w:b/>
-                <w:rFonts w:ascii="Times New Roman" w:hAnsi="Times New Roman" w:eastAsia="Times New Roman" w:cs="Times New Roman"/>
-                <w:sz w:val="24"/>
-                <w:szCs w:val="24"/>
-                <w:color w:val="000000"/>
-              </w:rPr>
-              <w:t>Поле</w:t>
-            </w:r>
-          </w:p>
-        </w:tc>
-        <w:tc>
-          <w:tcPr>
-            <w:tcW w:type="dxa" w:w="7087"/>
-            <w:tcBorders>
-              <w:top w:val="single" w:sz="4" w:color="D9D9D9"/>
-              <w:left w:val="single" w:sz="4" w:color="D9D9D9"/>
-              <w:bottom w:val="single" w:sz="4" w:color="D9D9D9"/>
-              <w:right w:val="single" w:sz="4" w:color="D9D9D9"/>
-            </w:tcBorders>
-            <w:shd w:fill="E7E6E6"/>
-          </w:tcPr>
-          <w:p>
-            <w:r>
-              <w:rPr>
-                <w:b/>
-                <w:rFonts w:ascii="Times New Roman" w:hAnsi="Times New Roman" w:eastAsia="Times New Roman" w:cs="Times New Roman"/>
-                <w:sz w:val="24"/>
-                <w:szCs w:val="24"/>
-                <w:color w:val="000000"/>
-              </w:rPr>
-              <w:t>Содержание</w:t>
-            </w:r>
-          </w:p>
-        </w:tc>
-      </w:tr>
-      <w:tr>
-        <w:tc>
-          <w:tcPr>
-            <w:tcW w:type="dxa" w:w="2268"/>
+            <w:tcW w:type="dxa" w:w="2835"/>
+            <w:vAlign w:val="center"/>
+            <w:shd w:fill="E7EDF5"/>
+            <w:tcMar>
+              <w:top w:w="100" w:type="dxa"/>
+              <w:left w:w="100" w:type="dxa"/>
+              <w:bottom w:w="100" w:type="dxa"/>
+              <w:right w:w="100" w:type="dxa"/>
+            </w:tcMar>
             <w:tcBorders>
               <w:top w:val="single" w:sz="4" w:color="D9D9D9"/>
               <w:left w:val="single" w:sz="4" w:color="D9D9D9"/>
@@ -1984,20 +2125,31 @@
             </w:tcBorders>
           </w:tcPr>
           <w:p>
+            <w:pPr>
+              <w:spacing w:after="80" w:before="80"/>
+            </w:pPr>
             <w:r>
               <w:rPr>
-                <w:rFonts w:ascii="Times New Roman" w:hAnsi="Times New Roman" w:eastAsia="Times New Roman" w:cs="Times New Roman"/>
+                <w:b/>
                 <w:sz w:val="24"/>
                 <w:szCs w:val="24"/>
-                <w:color w:val="000000"/>
+                <w:rFonts w:ascii="Times New Roman" w:hAnsi="Times New Roman" w:cs="Times New Roman" w:eastAsia="Times New Roman"/>
               </w:rPr>
-              <w:t>Название</w:t>
+              <w:t>Участник</w:t>
             </w:r>
           </w:p>
         </w:tc>
         <w:tc>
           <w:tcPr>
-            <w:tcW w:type="dxa" w:w="7087"/>
+            <w:tcW w:type="dxa" w:w="6520"/>
+            <w:vAlign w:val="center"/>
+            <w:shd w:fill="E7EDF5"/>
+            <w:tcMar>
+              <w:top w:w="100" w:type="dxa"/>
+              <w:left w:w="100" w:type="dxa"/>
+              <w:bottom w:w="100" w:type="dxa"/>
+              <w:right w:w="100" w:type="dxa"/>
+            </w:tcMar>
             <w:tcBorders>
               <w:top w:val="single" w:sz="4" w:color="D9D9D9"/>
               <w:left w:val="single" w:sz="4" w:color="D9D9D9"/>
@@ -2006,22 +2158,36 @@
             </w:tcBorders>
           </w:tcPr>
           <w:p>
+            <w:pPr>
+              <w:spacing w:after="80" w:before="80"/>
+            </w:pPr>
             <w:r>
               <w:rPr>
-                <w:rFonts w:ascii="Times New Roman" w:hAnsi="Times New Roman" w:eastAsia="Times New Roman" w:cs="Times New Roman"/>
+                <w:b/>
                 <w:sz w:val="24"/>
                 <w:szCs w:val="24"/>
-                <w:color w:val="000000"/>
+                <w:rFonts w:ascii="Times New Roman" w:hAnsi="Times New Roman" w:cs="Times New Roman" w:eastAsia="Times New Roman"/>
               </w:rPr>
-              <w:t>Описание предметной области</w:t>
+              <w:t>Его действие</w:t>
             </w:r>
           </w:p>
         </w:tc>
       </w:tr>
       <w:tr>
+        <w:trPr>
+          <w:cantSplit/>
+        </w:trPr>
         <w:tc>
           <w:tcPr>
-            <w:tcW w:type="dxa" w:w="2268"/>
+            <w:tcW w:type="dxa" w:w="2835"/>
+            <w:vAlign w:val="center"/>
+            <w:shd w:fill="FFFFFF"/>
+            <w:tcMar>
+              <w:top w:w="100" w:type="dxa"/>
+              <w:left w:w="100" w:type="dxa"/>
+              <w:bottom w:w="100" w:type="dxa"/>
+              <w:right w:w="100" w:type="dxa"/>
+            </w:tcMar>
             <w:tcBorders>
               <w:top w:val="single" w:sz="4" w:color="D9D9D9"/>
               <w:left w:val="single" w:sz="4" w:color="D9D9D9"/>
@@ -2030,20 +2196,30 @@
             </w:tcBorders>
           </w:tcPr>
           <w:p>
+            <w:pPr>
+              <w:spacing w:after="80" w:before="80"/>
+            </w:pPr>
             <w:r>
               <w:rPr>
-                <w:rFonts w:ascii="Times New Roman" w:hAnsi="Times New Roman" w:eastAsia="Times New Roman" w:cs="Times New Roman"/>
+                <w:b w:val="0"/>
                 <w:sz w:val="24"/>
                 <w:szCs w:val="24"/>
-                <w:color w:val="000000"/>
+                <w:rFonts w:ascii="Times New Roman" w:hAnsi="Times New Roman" w:cs="Times New Roman" w:eastAsia="Times New Roman"/>
               </w:rPr>
-              <w:t>Цель</w:t>
             </w:r>
           </w:p>
         </w:tc>
         <w:tc>
           <w:tcPr>
-            <w:tcW w:type="dxa" w:w="7087"/>
+            <w:tcW w:type="dxa" w:w="6520"/>
+            <w:vAlign w:val="center"/>
+            <w:shd w:fill="FFFFFF"/>
+            <w:tcMar>
+              <w:top w:w="100" w:type="dxa"/>
+              <w:left w:w="100" w:type="dxa"/>
+              <w:bottom w:w="100" w:type="dxa"/>
+              <w:right w:w="100" w:type="dxa"/>
+            </w:tcMar>
             <w:tcBorders>
               <w:top w:val="single" w:sz="4" w:color="D9D9D9"/>
               <w:left w:val="single" w:sz="4" w:color="D9D9D9"/>
@@ -2052,22 +2228,35 @@
             </w:tcBorders>
           </w:tcPr>
           <w:p>
+            <w:pPr>
+              <w:spacing w:after="80" w:before="80"/>
+            </w:pPr>
             <w:r>
               <w:rPr>
-                <w:rFonts w:ascii="Times New Roman" w:hAnsi="Times New Roman" w:eastAsia="Times New Roman" w:cs="Times New Roman"/>
+                <w:b w:val="0"/>
                 <w:sz w:val="24"/>
                 <w:szCs w:val="24"/>
-                <w:color w:val="000000"/>
+                <w:rFonts w:ascii="Times New Roman" w:hAnsi="Times New Roman" w:cs="Times New Roman" w:eastAsia="Times New Roman"/>
               </w:rPr>
-              <w:t>Описание процесса и таблица участников.</w:t>
             </w:r>
           </w:p>
         </w:tc>
       </w:tr>
       <w:tr>
+        <w:trPr>
+          <w:cantSplit/>
+        </w:trPr>
         <w:tc>
           <w:tcPr>
-            <w:tcW w:type="dxa" w:w="2268"/>
+            <w:tcW w:type="dxa" w:w="2835"/>
+            <w:vAlign w:val="center"/>
+            <w:shd w:fill="F7F8FA"/>
+            <w:tcMar>
+              <w:top w:w="100" w:type="dxa"/>
+              <w:left w:w="100" w:type="dxa"/>
+              <w:bottom w:w="100" w:type="dxa"/>
+              <w:right w:w="100" w:type="dxa"/>
+            </w:tcMar>
             <w:tcBorders>
               <w:top w:val="single" w:sz="4" w:color="D9D9D9"/>
               <w:left w:val="single" w:sz="4" w:color="D9D9D9"/>
@@ -2076,20 +2265,30 @@
             </w:tcBorders>
           </w:tcPr>
           <w:p>
+            <w:pPr>
+              <w:spacing w:after="80" w:before="80"/>
+            </w:pPr>
             <w:r>
               <w:rPr>
-                <w:rFonts w:ascii="Times New Roman" w:hAnsi="Times New Roman" w:eastAsia="Times New Roman" w:cs="Times New Roman"/>
+                <w:b w:val="0"/>
                 <w:sz w:val="24"/>
                 <w:szCs w:val="24"/>
-                <w:color w:val="000000"/>
+                <w:rFonts w:ascii="Times New Roman" w:hAnsi="Times New Roman" w:cs="Times New Roman" w:eastAsia="Times New Roman"/>
               </w:rPr>
-              <w:t>Практический навык</w:t>
             </w:r>
           </w:p>
         </w:tc>
         <w:tc>
           <w:tcPr>
-            <w:tcW w:type="dxa" w:w="7087"/>
+            <w:tcW w:type="dxa" w:w="6520"/>
+            <w:vAlign w:val="center"/>
+            <w:shd w:fill="F7F8FA"/>
+            <w:tcMar>
+              <w:top w:w="100" w:type="dxa"/>
+              <w:left w:w="100" w:type="dxa"/>
+              <w:bottom w:w="100" w:type="dxa"/>
+              <w:right w:w="100" w:type="dxa"/>
+            </w:tcMar>
             <w:tcBorders>
               <w:top w:val="single" w:sz="4" w:color="D9D9D9"/>
               <w:left w:val="single" w:sz="4" w:color="D9D9D9"/>
@@ -2098,22 +2297,35 @@
             </w:tcBorders>
           </w:tcPr>
           <w:p>
+            <w:pPr>
+              <w:spacing w:after="80" w:before="80"/>
+            </w:pPr>
             <w:r>
               <w:rPr>
-                <w:rFonts w:ascii="Times New Roman" w:hAnsi="Times New Roman" w:eastAsia="Times New Roman" w:cs="Times New Roman"/>
+                <w:b w:val="0"/>
                 <w:sz w:val="24"/>
                 <w:szCs w:val="24"/>
-                <w:color w:val="000000"/>
+                <w:rFonts w:ascii="Times New Roman" w:hAnsi="Times New Roman" w:cs="Times New Roman" w:eastAsia="Times New Roman"/>
               </w:rPr>
-              <w:t>Описание процесса в 3–5 предложениях</w:t>
             </w:r>
           </w:p>
         </w:tc>
       </w:tr>
       <w:tr>
+        <w:trPr>
+          <w:cantSplit/>
+        </w:trPr>
         <w:tc>
           <w:tcPr>
-            <w:tcW w:type="dxa" w:w="2268"/>
+            <w:tcW w:type="dxa" w:w="2835"/>
+            <w:vAlign w:val="center"/>
+            <w:shd w:fill="FFFFFF"/>
+            <w:tcMar>
+              <w:top w:w="100" w:type="dxa"/>
+              <w:left w:w="100" w:type="dxa"/>
+              <w:bottom w:w="100" w:type="dxa"/>
+              <w:right w:w="100" w:type="dxa"/>
+            </w:tcMar>
             <w:tcBorders>
               <w:top w:val="single" w:sz="4" w:color="D9D9D9"/>
               <w:left w:val="single" w:sz="4" w:color="D9D9D9"/>
@@ -2122,20 +2334,30 @@
             </w:tcBorders>
           </w:tcPr>
           <w:p>
+            <w:pPr>
+              <w:spacing w:after="80" w:before="80"/>
+            </w:pPr>
             <w:r>
               <w:rPr>
-                <w:rFonts w:ascii="Times New Roman" w:hAnsi="Times New Roman" w:eastAsia="Times New Roman" w:cs="Times New Roman"/>
+                <w:b w:val="0"/>
                 <w:sz w:val="24"/>
                 <w:szCs w:val="24"/>
-                <w:color w:val="000000"/>
+                <w:rFonts w:ascii="Times New Roman" w:hAnsi="Times New Roman" w:cs="Times New Roman" w:eastAsia="Times New Roman"/>
               </w:rPr>
-              <w:t>Результат</w:t>
             </w:r>
           </w:p>
         </w:tc>
         <w:tc>
           <w:tcPr>
-            <w:tcW w:type="dxa" w:w="7087"/>
+            <w:tcW w:type="dxa" w:w="6520"/>
+            <w:vAlign w:val="center"/>
+            <w:shd w:fill="FFFFFF"/>
+            <w:tcMar>
+              <w:top w:w="100" w:type="dxa"/>
+              <w:left w:w="100" w:type="dxa"/>
+              <w:bottom w:w="100" w:type="dxa"/>
+              <w:right w:w="100" w:type="dxa"/>
+            </w:tcMar>
             <w:tcBorders>
               <w:top w:val="single" w:sz="4" w:color="D9D9D9"/>
               <w:left w:val="single" w:sz="4" w:color="D9D9D9"/>
@@ -2144,22 +2366,93 @@
             </w:tcBorders>
           </w:tcPr>
           <w:p>
+            <w:pPr>
+              <w:spacing w:after="80" w:before="80"/>
+            </w:pPr>
             <w:r>
               <w:rPr>
-                <w:rFonts w:ascii="Times New Roman" w:hAnsi="Times New Roman" w:eastAsia="Times New Roman" w:cs="Times New Roman"/>
+                <w:b w:val="0"/>
                 <w:sz w:val="24"/>
                 <w:szCs w:val="24"/>
-                <w:color w:val="000000"/>
+                <w:rFonts w:ascii="Times New Roman" w:hAnsi="Times New Roman" w:cs="Times New Roman" w:eastAsia="Times New Roman"/>
               </w:rPr>
-              <w:t>Описание процесса и таблица участников</w:t>
             </w:r>
           </w:p>
         </w:tc>
       </w:tr>
+    </w:tbl>
+    <w:p>
+      <w:pPr>
+        <w:spacing w:after="140"/>
+      </w:pPr>
+    </w:p>
+    <w:p>
+      <w:r>
+        <w:rPr>
+          <w:sz w:val="24"/>
+          <w:szCs w:val="24"/>
+          <w:rFonts w:ascii="Times New Roman" w:hAnsi="Times New Roman" w:cs="Times New Roman" w:eastAsia="Times New Roman"/>
+        </w:rPr>
+        <w:br w:type="page"/>
+      </w:r>
+    </w:p>
+    <w:p>
+      <w:pPr>
+        <w:pStyle w:val="1"/>
+        <w:spacing w:after="140"/>
+      </w:pPr>
+      <w:r>
+        <w:rPr>
+          <w:sz w:val="24"/>
+          <w:szCs w:val="24"/>
+          <w:rFonts w:ascii="Times New Roman" w:hAnsi="Times New Roman" w:cs="Times New Roman" w:eastAsia="Times New Roman"/>
+        </w:rPr>
+        <w:t>Шаг 3 Опишите путь заявки</w:t>
+      </w:r>
+    </w:p>
+    <w:p>
+      <w:pPr>
+        <w:spacing w:after="140"/>
+      </w:pPr>
+      <w:r>
+        <w:rPr>
+          <w:i/>
+          <w:color w:val="555555"/>
+          <w:sz w:val="24"/>
+          <w:szCs w:val="24"/>
+          <w:rFonts w:ascii="Times New Roman" w:hAnsi="Times New Roman" w:cs="Times New Roman" w:eastAsia="Times New Roman"/>
+        </w:rPr>
+        <w:t>Укажите начало, обработку и завершение. Для каждого действия назовите исполнителя.</w:t>
+      </w:r>
+    </w:p>
+    <w:tbl>
+      <w:tblPr>
+        <w:tblW w:type="auto" w:w="0"/>
+        <w:jc w:val="center"/>
+        <w:tblLayout w:type="fixed"/>
+        <w:tblLook w:firstColumn="1" w:firstRow="1" w:lastColumn="0" w:lastRow="0" w:noHBand="0" w:noVBand="1" w:val="04A0"/>
+      </w:tblPr>
+      <w:tblGrid>
+        <w:gridCol w:w="1020"/>
+        <w:gridCol w:w="2835"/>
+        <w:gridCol w:w="5499"/>
+      </w:tblGrid>
       <w:tr>
+        <w:trPr>
+          <w:cantSplit/>
+          <w:tblHeader/>
+        </w:trPr>
         <w:tc>
           <w:tcPr>
-            <w:tcW w:type="dxa" w:w="2268"/>
+            <w:tcW w:type="dxa" w:w="1020"/>
+            <w:vAlign w:val="center"/>
+            <w:shd w:fill="E7EDF5"/>
+            <w:tcMar>
+              <w:top w:w="100" w:type="dxa"/>
+              <w:left w:w="100" w:type="dxa"/>
+              <w:bottom w:w="100" w:type="dxa"/>
+              <w:right w:w="100" w:type="dxa"/>
+            </w:tcMar>
             <w:tcBorders>
               <w:top w:val="single" w:sz="4" w:color="D9D9D9"/>
               <w:left w:val="single" w:sz="4" w:color="D9D9D9"/>
@@ -2168,20 +2461,31 @@
             </w:tcBorders>
           </w:tcPr>
           <w:p>
+            <w:pPr>
+              <w:spacing w:after="80" w:before="80"/>
+            </w:pPr>
             <w:r>
               <w:rPr>
-                <w:rFonts w:ascii="Times New Roman" w:hAnsi="Times New Roman" w:eastAsia="Times New Roman" w:cs="Times New Roman"/>
+                <w:b/>
                 <w:sz w:val="24"/>
                 <w:szCs w:val="24"/>
-                <w:color w:val="000000"/>
+                <w:rFonts w:ascii="Times New Roman" w:hAnsi="Times New Roman" w:cs="Times New Roman" w:eastAsia="Times New Roman"/>
               </w:rPr>
-              <w:t>Имя файла</w:t>
+              <w:t>Этап</w:t>
             </w:r>
           </w:p>
         </w:tc>
         <w:tc>
           <w:tcPr>
-            <w:tcW w:type="dxa" w:w="7087"/>
+            <w:tcW w:type="dxa" w:w="2835"/>
+            <w:vAlign w:val="center"/>
+            <w:shd w:fill="E7EDF5"/>
+            <w:tcMar>
+              <w:top w:w="100" w:type="dxa"/>
+              <w:left w:w="100" w:type="dxa"/>
+              <w:bottom w:w="100" w:type="dxa"/>
+              <w:right w:w="100" w:type="dxa"/>
+            </w:tcMar>
             <w:tcBorders>
               <w:top w:val="single" w:sz="4" w:color="D9D9D9"/>
               <w:left w:val="single" w:sz="4" w:color="D9D9D9"/>
@@ -2190,253 +2494,31 @@
             </w:tcBorders>
           </w:tcPr>
           <w:p>
-            <w:r>
-              <w:rPr>
-                <w:rFonts w:ascii="Times New Roman" w:hAnsi="Times New Roman" w:eastAsia="Times New Roman" w:cs="Times New Roman"/>
-                <w:sz w:val="24"/>
-                <w:szCs w:val="24"/>
-                <w:color w:val="000000"/>
-              </w:rPr>
-              <w:t>ЛР01_Вариант_Фамилия.docx</w:t>
-            </w:r>
-          </w:p>
-        </w:tc>
-      </w:tr>
-    </w:tbl>
-    <w:p>
-      <w:r>
-        <w:rPr>
-          <w:rFonts w:ascii="Times New Roman" w:hAnsi="Times New Roman" w:eastAsia="Times New Roman" w:cs="Times New Roman"/>
-          <w:sz w:val="24"/>
-          <w:szCs w:val="24"/>
-          <w:color w:val="000000"/>
-        </w:rPr>
-        <w:t>Вариант __________  Предметная область ____________________</w:t>
-      </w:r>
-    </w:p>
-    <w:p>
-      <w:pPr>
-        <w:pStyle w:val="2"/>
-        <w:keepNext/>
-      </w:pPr>
-      <w:r>
-        <w:rPr>
-          <w:rFonts w:ascii="Times New Roman" w:hAnsi="Times New Roman" w:eastAsia="Times New Roman" w:cs="Times New Roman"/>
-          <w:sz w:val="24"/>
-          <w:szCs w:val="24"/>
-          <w:b/>
-          <w:color w:val="000000"/>
-        </w:rPr>
-        <w:t>Пояснение к задаче по предметной области</w:t>
-      </w:r>
-    </w:p>
-    <w:p>
-      <w:r>
-        <w:rPr>
-          <w:rFonts w:ascii="Times New Roman" w:hAnsi="Times New Roman" w:eastAsia="Times New Roman" w:cs="Times New Roman"/>
-          <w:sz w:val="24"/>
-          <w:szCs w:val="24"/>
-          <w:color w:val="000000"/>
-        </w:rPr>
-        <w:t>Вы работаете с учебным процессом выбранного варианта. Используйте только выданные записи и явно отмечайте свои предположения.</w:t>
-      </w:r>
-    </w:p>
-    <w:p>
-      <w:pPr>
-        <w:pStyle w:val="2"/>
-        <w:keepNext/>
-      </w:pPr>
-      <w:r>
-        <w:rPr>
-          <w:rFonts w:ascii="Times New Roman" w:hAnsi="Times New Roman" w:eastAsia="Times New Roman" w:cs="Times New Roman"/>
-          <w:sz w:val="24"/>
-          <w:szCs w:val="24"/>
-          <w:b/>
-          <w:color w:val="000000"/>
-        </w:rPr>
-        <w:t>Материалы для выполнения</w:t>
-      </w:r>
-    </w:p>
-    <w:p>
-      <w:pPr>
-        <w:pStyle w:val="PIDISBullet"/>
-      </w:pPr>
-      <w:r>
-        <w:rPr>
-          <w:rFonts w:ascii="Times New Roman" w:hAnsi="Times New Roman" w:eastAsia="Times New Roman" w:cs="Times New Roman"/>
-          <w:sz w:val="24"/>
-          <w:szCs w:val="24"/>
-          <w:color w:val="000000"/>
-        </w:rPr>
-        <w:t>Описание выбранного варианта в задании HTML.</w:t>
-      </w:r>
-    </w:p>
-    <w:p>
-      <w:pPr>
-        <w:pStyle w:val="PIDISBullet"/>
-      </w:pPr>
-      <w:r>
-        <w:rPr>
-          <w:rFonts w:ascii="Times New Roman" w:hAnsi="Times New Roman" w:eastAsia="Times New Roman" w:cs="Times New Roman"/>
-          <w:sz w:val="24"/>
-          <w:szCs w:val="24"/>
-          <w:color w:val="000000"/>
-        </w:rPr>
-        <w:t>Таблицы CSV и пояснение MD из папки этой работы.</w:t>
-      </w:r>
-    </w:p>
-    <w:p>
-      <w:pPr>
-        <w:pStyle w:val="PIDISBullet"/>
-      </w:pPr>
-      <w:r>
-        <w:rPr>
-          <w:rFonts w:ascii="Times New Roman" w:hAnsi="Times New Roman" w:eastAsia="Times New Roman" w:cs="Times New Roman"/>
-          <w:sz w:val="24"/>
-          <w:szCs w:val="24"/>
-          <w:color w:val="000000"/>
-        </w:rPr>
-        <w:t>Результаты предыдущей работы, если они указаны в задании.</w:t>
-      </w:r>
-    </w:p>
-    <w:p>
-      <w:r>
-        <w:rPr>
-          <w:rFonts w:ascii="Times New Roman" w:hAnsi="Times New Roman" w:eastAsia="Times New Roman" w:cs="Times New Roman"/>
-          <w:sz w:val="24"/>
-          <w:szCs w:val="24"/>
-          <w:color w:val="000000"/>
-        </w:rPr>
-        <w:t>Используйте только выданные данные. Не добавляйте неподтверждённые факты. Поля ответа заполняет студент.</w:t>
-      </w:r>
-    </w:p>
-    <w:p>
-      <w:r>
-        <w:rPr>
-          <w:rFonts w:ascii="Times New Roman" w:hAnsi="Times New Roman" w:eastAsia="Times New Roman" w:cs="Times New Roman"/>
-          <w:sz w:val="24"/>
-          <w:szCs w:val="24"/>
-          <w:color w:val="000000"/>
-        </w:rPr>
-        <w:br w:type="page"/>
-      </w:r>
-    </w:p>
-    <w:p>
-      <w:pPr>
-        <w:pStyle w:val="1"/>
-        <w:keepNext/>
-      </w:pPr>
-      <w:r>
-        <w:rPr>
-          <w:rFonts w:ascii="Times New Roman" w:hAnsi="Times New Roman" w:eastAsia="Times New Roman" w:cs="Times New Roman"/>
-          <w:sz w:val="24"/>
-          <w:szCs w:val="24"/>
-          <w:b/>
-          <w:color w:val="000000"/>
-        </w:rPr>
-        <w:t>Основной результат работы</w:t>
-      </w:r>
-    </w:p>
-    <w:p>
-      <w:r>
-        <w:rPr>
-          <w:rFonts w:ascii="Times New Roman" w:hAnsi="Times New Roman" w:eastAsia="Times New Roman" w:cs="Times New Roman"/>
-          <w:sz w:val="24"/>
-          <w:szCs w:val="24"/>
-          <w:color w:val="000000"/>
-        </w:rPr>
-        <w:t>Заполните таблицу. Добавляйте строки при необходимости; не уменьшайте шрифт для размещения ответа.</w:t>
-      </w:r>
-    </w:p>
-    <w:tbl>
-      <w:tblPr>
-        <w:tblW w:type="auto" w:w="0"/>
-        <w:tblLayout w:type="fixed"/>
-        <w:tblLook w:firstColumn="1" w:firstRow="1" w:lastColumn="0" w:lastRow="0" w:noHBand="0" w:noVBand="1" w:val="04A0"/>
-      </w:tblPr>
-      <w:tblGrid>
-        <w:gridCol w:w="3118"/>
-        <w:gridCol w:w="3402"/>
-        <w:gridCol w:w="2835"/>
-      </w:tblGrid>
-      <w:tr>
-        <w:tc>
-          <w:tcPr>
-            <w:tcW w:type="dxa" w:w="3118"/>
-            <w:tcBorders>
-              <w:top w:val="single" w:sz="4" w:color="D9D9D9"/>
-              <w:left w:val="single" w:sz="4" w:color="D9D9D9"/>
-              <w:bottom w:val="single" w:sz="4" w:color="D9D9D9"/>
-              <w:right w:val="single" w:sz="4" w:color="D9D9D9"/>
-            </w:tcBorders>
-            <w:shd w:fill="E7E6E6"/>
-          </w:tcPr>
-          <w:p>
+            <w:pPr>
+              <w:spacing w:after="80" w:before="80"/>
+            </w:pPr>
             <w:r>
               <w:rPr>
                 <w:b/>
-                <w:rFonts w:ascii="Times New Roman" w:hAnsi="Times New Roman" w:eastAsia="Times New Roman" w:cs="Times New Roman"/>
                 <w:sz w:val="24"/>
                 <w:szCs w:val="24"/>
-                <w:color w:val="000000"/>
+                <w:rFonts w:ascii="Times New Roman" w:hAnsi="Times New Roman" w:cs="Times New Roman" w:eastAsia="Times New Roman"/>
               </w:rPr>
-              <w:t>Что подготовить</w:t>
+              <w:t>Кто выполняет</w:t>
             </w:r>
           </w:p>
         </w:tc>
         <w:tc>
           <w:tcPr>
-            <w:tcW w:type="dxa" w:w="3402"/>
-            <w:tcBorders>
-              <w:top w:val="single" w:sz="4" w:color="D9D9D9"/>
-              <w:left w:val="single" w:sz="4" w:color="D9D9D9"/>
-              <w:bottom w:val="single" w:sz="4" w:color="D9D9D9"/>
-              <w:right w:val="single" w:sz="4" w:color="D9D9D9"/>
-            </w:tcBorders>
-            <w:shd w:fill="E7E6E6"/>
-          </w:tcPr>
-          <w:p>
-            <w:r>
-              <w:rPr>
-                <w:b/>
-                <w:rFonts w:ascii="Times New Roman" w:hAnsi="Times New Roman" w:eastAsia="Times New Roman" w:cs="Times New Roman"/>
-                <w:sz w:val="24"/>
-                <w:szCs w:val="24"/>
-                <w:color w:val="000000"/>
-              </w:rPr>
-              <w:t>Результат студента</w:t>
-            </w:r>
-          </w:p>
-        </w:tc>
-        <w:tc>
-          <w:tcPr>
-            <w:tcW w:type="dxa" w:w="2835"/>
-            <w:tcBorders>
-              <w:top w:val="single" w:sz="4" w:color="D9D9D9"/>
-              <w:left w:val="single" w:sz="4" w:color="D9D9D9"/>
-              <w:bottom w:val="single" w:sz="4" w:color="D9D9D9"/>
-              <w:right w:val="single" w:sz="4" w:color="D9D9D9"/>
-            </w:tcBorders>
-            <w:shd w:fill="E7E6E6"/>
-          </w:tcPr>
-          <w:p>
-            <w:r>
-              <w:rPr>
-                <w:b/>
-                <w:rFonts w:ascii="Times New Roman" w:hAnsi="Times New Roman" w:eastAsia="Times New Roman" w:cs="Times New Roman"/>
-                <w:sz w:val="24"/>
-                <w:szCs w:val="24"/>
-                <w:color w:val="000000"/>
-              </w:rPr>
-              <w:t>Пояснение или источник</w:t>
-            </w:r>
-          </w:p>
-        </w:tc>
-      </w:tr>
-      <w:tr>
-        <w:tc>
-          <w:tcPr>
-            <w:tcW w:type="dxa" w:w="3118"/>
+            <w:tcW w:type="dxa" w:w="5499"/>
+            <w:vAlign w:val="center"/>
+            <w:shd w:fill="E7EDF5"/>
+            <w:tcMar>
+              <w:top w:w="100" w:type="dxa"/>
+              <w:left w:w="100" w:type="dxa"/>
+              <w:bottom w:w="100" w:type="dxa"/>
+              <w:right w:w="100" w:type="dxa"/>
+            </w:tcMar>
             <w:tcBorders>
               <w:top w:val="single" w:sz="4" w:color="D9D9D9"/>
               <w:left w:val="single" w:sz="4" w:color="D9D9D9"/>
@@ -2445,20 +2527,36 @@
             </w:tcBorders>
           </w:tcPr>
           <w:p>
+            <w:pPr>
+              <w:spacing w:after="80" w:before="80"/>
+            </w:pPr>
             <w:r>
               <w:rPr>
-                <w:rFonts w:ascii="Times New Roman" w:hAnsi="Times New Roman" w:eastAsia="Times New Roman" w:cs="Times New Roman"/>
+                <w:b/>
                 <w:sz w:val="24"/>
                 <w:szCs w:val="24"/>
-                <w:color w:val="000000"/>
+                <w:rFonts w:ascii="Times New Roman" w:hAnsi="Times New Roman" w:cs="Times New Roman" w:eastAsia="Times New Roman"/>
               </w:rPr>
-              <w:t>Описание процесса в 3–5 предложениях</w:t>
+              <w:t>Что происходит</w:t>
             </w:r>
           </w:p>
         </w:tc>
+      </w:tr>
+      <w:tr>
+        <w:trPr>
+          <w:cantSplit/>
+        </w:trPr>
         <w:tc>
           <w:tcPr>
-            <w:tcW w:type="dxa" w:w="3402"/>
+            <w:tcW w:type="dxa" w:w="1020"/>
+            <w:vAlign w:val="center"/>
+            <w:shd w:fill="FFFFFF"/>
+            <w:tcMar>
+              <w:top w:w="100" w:type="dxa"/>
+              <w:left w:w="100" w:type="dxa"/>
+              <w:bottom w:w="100" w:type="dxa"/>
+              <w:right w:w="100" w:type="dxa"/>
+            </w:tcMar>
             <w:tcBorders>
               <w:top w:val="single" w:sz="4" w:color="D9D9D9"/>
               <w:left w:val="single" w:sz="4" w:color="D9D9D9"/>
@@ -2467,19 +2565,31 @@
             </w:tcBorders>
           </w:tcPr>
           <w:p>
+            <w:pPr>
+              <w:spacing w:after="80" w:before="80"/>
+            </w:pPr>
             <w:r>
               <w:rPr>
-                <w:rFonts w:ascii="Times New Roman" w:hAnsi="Times New Roman" w:eastAsia="Times New Roman" w:cs="Times New Roman"/>
+                <w:b w:val="0"/>
                 <w:sz w:val="24"/>
                 <w:szCs w:val="24"/>
-                <w:color w:val="000000"/>
+                <w:rFonts w:ascii="Times New Roman" w:hAnsi="Times New Roman" w:cs="Times New Roman" w:eastAsia="Times New Roman"/>
               </w:rPr>
+              <w:t>1</w:t>
             </w:r>
           </w:p>
         </w:tc>
         <w:tc>
           <w:tcPr>
             <w:tcW w:type="dxa" w:w="2835"/>
+            <w:vAlign w:val="center"/>
+            <w:shd w:fill="FFFFFF"/>
+            <w:tcMar>
+              <w:top w:w="100" w:type="dxa"/>
+              <w:left w:w="100" w:type="dxa"/>
+              <w:bottom w:w="100" w:type="dxa"/>
+              <w:right w:w="100" w:type="dxa"/>
+            </w:tcMar>
             <w:tcBorders>
               <w:top w:val="single" w:sz="4" w:color="D9D9D9"/>
               <w:left w:val="single" w:sz="4" w:color="D9D9D9"/>
@@ -2488,21 +2598,30 @@
             </w:tcBorders>
           </w:tcPr>
           <w:p>
+            <w:pPr>
+              <w:spacing w:after="80" w:before="80"/>
+            </w:pPr>
             <w:r>
               <w:rPr>
-                <w:rFonts w:ascii="Times New Roman" w:hAnsi="Times New Roman" w:eastAsia="Times New Roman" w:cs="Times New Roman"/>
+                <w:b w:val="0"/>
                 <w:sz w:val="24"/>
                 <w:szCs w:val="24"/>
-                <w:color w:val="000000"/>
+                <w:rFonts w:ascii="Times New Roman" w:hAnsi="Times New Roman" w:cs="Times New Roman" w:eastAsia="Times New Roman"/>
               </w:rPr>
             </w:r>
           </w:p>
         </w:tc>
-      </w:tr>
-      <w:tr>
         <w:tc>
           <w:tcPr>
-            <w:tcW w:type="dxa" w:w="3118"/>
+            <w:tcW w:type="dxa" w:w="5499"/>
+            <w:vAlign w:val="center"/>
+            <w:shd w:fill="FFFFFF"/>
+            <w:tcMar>
+              <w:top w:w="100" w:type="dxa"/>
+              <w:left w:w="100" w:type="dxa"/>
+              <w:bottom w:w="100" w:type="dxa"/>
+              <w:right w:w="100" w:type="dxa"/>
+            </w:tcMar>
             <w:tcBorders>
               <w:top w:val="single" w:sz="4" w:color="D9D9D9"/>
               <w:left w:val="single" w:sz="4" w:color="D9D9D9"/>
@@ -2511,20 +2630,35 @@
             </w:tcBorders>
           </w:tcPr>
           <w:p>
+            <w:pPr>
+              <w:spacing w:after="80" w:before="80"/>
+            </w:pPr>
             <w:r>
               <w:rPr>
-                <w:rFonts w:ascii="Times New Roman" w:hAnsi="Times New Roman" w:eastAsia="Times New Roman" w:cs="Times New Roman"/>
+                <w:b w:val="0"/>
                 <w:sz w:val="24"/>
                 <w:szCs w:val="24"/>
-                <w:color w:val="000000"/>
+                <w:rFonts w:ascii="Times New Roman" w:hAnsi="Times New Roman" w:cs="Times New Roman" w:eastAsia="Times New Roman"/>
               </w:rPr>
-              <w:t>Таблица участников и их действий</w:t>
             </w:r>
           </w:p>
         </w:tc>
+      </w:tr>
+      <w:tr>
+        <w:trPr>
+          <w:cantSplit/>
+        </w:trPr>
         <w:tc>
           <w:tcPr>
-            <w:tcW w:type="dxa" w:w="3402"/>
+            <w:tcW w:type="dxa" w:w="1020"/>
+            <w:vAlign w:val="center"/>
+            <w:shd w:fill="F7F8FA"/>
+            <w:tcMar>
+              <w:top w:w="100" w:type="dxa"/>
+              <w:left w:w="100" w:type="dxa"/>
+              <w:bottom w:w="100" w:type="dxa"/>
+              <w:right w:w="100" w:type="dxa"/>
+            </w:tcMar>
             <w:tcBorders>
               <w:top w:val="single" w:sz="4" w:color="D9D9D9"/>
               <w:left w:val="single" w:sz="4" w:color="D9D9D9"/>
@@ -2533,19 +2667,31 @@
             </w:tcBorders>
           </w:tcPr>
           <w:p>
+            <w:pPr>
+              <w:spacing w:after="80" w:before="80"/>
+            </w:pPr>
             <w:r>
               <w:rPr>
-                <w:rFonts w:ascii="Times New Roman" w:hAnsi="Times New Roman" w:eastAsia="Times New Roman" w:cs="Times New Roman"/>
+                <w:b w:val="0"/>
                 <w:sz w:val="24"/>
                 <w:szCs w:val="24"/>
-                <w:color w:val="000000"/>
+                <w:rFonts w:ascii="Times New Roman" w:hAnsi="Times New Roman" w:cs="Times New Roman" w:eastAsia="Times New Roman"/>
               </w:rPr>
+              <w:t>2</w:t>
             </w:r>
           </w:p>
         </w:tc>
         <w:tc>
           <w:tcPr>
             <w:tcW w:type="dxa" w:w="2835"/>
+            <w:vAlign w:val="center"/>
+            <w:shd w:fill="F7F8FA"/>
+            <w:tcMar>
+              <w:top w:w="100" w:type="dxa"/>
+              <w:left w:w="100" w:type="dxa"/>
+              <w:bottom w:w="100" w:type="dxa"/>
+              <w:right w:w="100" w:type="dxa"/>
+            </w:tcMar>
             <w:tcBorders>
               <w:top w:val="single" w:sz="4" w:color="D9D9D9"/>
               <w:left w:val="single" w:sz="4" w:color="D9D9D9"/>
@@ -2554,21 +2700,30 @@
             </w:tcBorders>
           </w:tcPr>
           <w:p>
+            <w:pPr>
+              <w:spacing w:after="80" w:before="80"/>
+            </w:pPr>
             <w:r>
               <w:rPr>
-                <w:rFonts w:ascii="Times New Roman" w:hAnsi="Times New Roman" w:eastAsia="Times New Roman" w:cs="Times New Roman"/>
+                <w:b w:val="0"/>
                 <w:sz w:val="24"/>
                 <w:szCs w:val="24"/>
-                <w:color w:val="000000"/>
+                <w:rFonts w:ascii="Times New Roman" w:hAnsi="Times New Roman" w:cs="Times New Roman" w:eastAsia="Times New Roman"/>
               </w:rPr>
             </w:r>
           </w:p>
         </w:tc>
-      </w:tr>
-      <w:tr>
         <w:tc>
           <w:tcPr>
-            <w:tcW w:type="dxa" w:w="3118"/>
+            <w:tcW w:type="dxa" w:w="5499"/>
+            <w:vAlign w:val="center"/>
+            <w:shd w:fill="F7F8FA"/>
+            <w:tcMar>
+              <w:top w:w="100" w:type="dxa"/>
+              <w:left w:w="100" w:type="dxa"/>
+              <w:bottom w:w="100" w:type="dxa"/>
+              <w:right w:w="100" w:type="dxa"/>
+            </w:tcMar>
             <w:tcBorders>
               <w:top w:val="single" w:sz="4" w:color="D9D9D9"/>
               <w:left w:val="single" w:sz="4" w:color="D9D9D9"/>
@@ -2577,20 +2732,35 @@
             </w:tcBorders>
           </w:tcPr>
           <w:p>
+            <w:pPr>
+              <w:spacing w:after="80" w:before="80"/>
+            </w:pPr>
             <w:r>
               <w:rPr>
-                <w:rFonts w:ascii="Times New Roman" w:hAnsi="Times New Roman" w:eastAsia="Times New Roman" w:cs="Times New Roman"/>
+                <w:b w:val="0"/>
                 <w:sz w:val="24"/>
                 <w:szCs w:val="24"/>
-                <w:color w:val="000000"/>
+                <w:rFonts w:ascii="Times New Roman" w:hAnsi="Times New Roman" w:cs="Times New Roman" w:eastAsia="Times New Roman"/>
               </w:rPr>
-              <w:t>Порядок прохождения одной заявки</w:t>
             </w:r>
           </w:p>
         </w:tc>
+      </w:tr>
+      <w:tr>
+        <w:trPr>
+          <w:cantSplit/>
+        </w:trPr>
         <w:tc>
           <w:tcPr>
-            <w:tcW w:type="dxa" w:w="3402"/>
+            <w:tcW w:type="dxa" w:w="1020"/>
+            <w:vAlign w:val="center"/>
+            <w:shd w:fill="FFFFFF"/>
+            <w:tcMar>
+              <w:top w:w="100" w:type="dxa"/>
+              <w:left w:w="100" w:type="dxa"/>
+              <w:bottom w:w="100" w:type="dxa"/>
+              <w:right w:w="100" w:type="dxa"/>
+            </w:tcMar>
             <w:tcBorders>
               <w:top w:val="single" w:sz="4" w:color="D9D9D9"/>
               <w:left w:val="single" w:sz="4" w:color="D9D9D9"/>
@@ -2599,19 +2769,31 @@
             </w:tcBorders>
           </w:tcPr>
           <w:p>
+            <w:pPr>
+              <w:spacing w:after="80" w:before="80"/>
+            </w:pPr>
             <w:r>
               <w:rPr>
-                <w:rFonts w:ascii="Times New Roman" w:hAnsi="Times New Roman" w:eastAsia="Times New Roman" w:cs="Times New Roman"/>
+                <w:b w:val="0"/>
                 <w:sz w:val="24"/>
                 <w:szCs w:val="24"/>
-                <w:color w:val="000000"/>
+                <w:rFonts w:ascii="Times New Roman" w:hAnsi="Times New Roman" w:cs="Times New Roman" w:eastAsia="Times New Roman"/>
               </w:rPr>
+              <w:t>3</w:t>
             </w:r>
           </w:p>
         </w:tc>
         <w:tc>
           <w:tcPr>
             <w:tcW w:type="dxa" w:w="2835"/>
+            <w:vAlign w:val="center"/>
+            <w:shd w:fill="FFFFFF"/>
+            <w:tcMar>
+              <w:top w:w="100" w:type="dxa"/>
+              <w:left w:w="100" w:type="dxa"/>
+              <w:bottom w:w="100" w:type="dxa"/>
+              <w:right w:w="100" w:type="dxa"/>
+            </w:tcMar>
             <w:tcBorders>
               <w:top w:val="single" w:sz="4" w:color="D9D9D9"/>
               <w:left w:val="single" w:sz="4" w:color="D9D9D9"/>
@@ -2620,12 +2802,47 @@
             </w:tcBorders>
           </w:tcPr>
           <w:p>
+            <w:pPr>
+              <w:spacing w:after="80" w:before="80"/>
+            </w:pPr>
             <w:r>
               <w:rPr>
-                <w:rFonts w:ascii="Times New Roman" w:hAnsi="Times New Roman" w:eastAsia="Times New Roman" w:cs="Times New Roman"/>
+                <w:b w:val="0"/>
                 <w:sz w:val="24"/>
                 <w:szCs w:val="24"/>
-                <w:color w:val="000000"/>
+                <w:rFonts w:ascii="Times New Roman" w:hAnsi="Times New Roman" w:cs="Times New Roman" w:eastAsia="Times New Roman"/>
+              </w:rPr>
+            </w:r>
+          </w:p>
+        </w:tc>
+        <w:tc>
+          <w:tcPr>
+            <w:tcW w:type="dxa" w:w="5499"/>
+            <w:vAlign w:val="center"/>
+            <w:shd w:fill="FFFFFF"/>
+            <w:tcMar>
+              <w:top w:w="100" w:type="dxa"/>
+              <w:left w:w="100" w:type="dxa"/>
+              <w:bottom w:w="100" w:type="dxa"/>
+              <w:right w:w="100" w:type="dxa"/>
+            </w:tcMar>
+            <w:tcBorders>
+              <w:top w:val="single" w:sz="4" w:color="D9D9D9"/>
+              <w:left w:val="single" w:sz="4" w:color="D9D9D9"/>
+              <w:bottom w:val="single" w:sz="4" w:color="D9D9D9"/>
+              <w:right w:val="single" w:sz="4" w:color="D9D9D9"/>
+            </w:tcBorders>
+          </w:tcPr>
+          <w:p>
+            <w:pPr>
+              <w:spacing w:after="80" w:before="80"/>
+            </w:pPr>
+            <w:r>
+              <w:rPr>
+                <w:b w:val="0"/>
+                <w:sz w:val="24"/>
+                <w:szCs w:val="24"/>
+                <w:rFonts w:ascii="Times New Roman" w:hAnsi="Times New Roman" w:cs="Times New Roman" w:eastAsia="Times New Roman"/>
               </w:rPr>
             </w:r>
           </w:p>
@@ -2634,34 +2851,42 @@
     </w:tbl>
     <w:p>
       <w:pPr>
-        <w:pStyle w:val="2"/>
-        <w:keepNext/>
+        <w:spacing w:after="140"/>
+      </w:pPr>
+    </w:p>
+    <w:p>
+      <w:pPr>
+        <w:pStyle w:val="1"/>
+        <w:spacing w:after="140"/>
       </w:pPr>
       <w:r>
         <w:rPr>
-          <w:rFonts w:ascii="Times New Roman" w:hAnsi="Times New Roman" w:eastAsia="Times New Roman" w:cs="Times New Roman"/>
           <w:sz w:val="24"/>
           <w:szCs w:val="24"/>
-          <w:b/>
-          <w:color w:val="000000"/>
+          <w:rFonts w:ascii="Times New Roman" w:hAnsi="Times New Roman" w:cs="Times New Roman" w:eastAsia="Times New Roman"/>
         </w:rPr>
-        <w:t>Место для рисунка</w:t>
+        <w:t>Необязательная схема</w:t>
       </w:r>
     </w:p>
     <w:p>
+      <w:pPr>
+        <w:spacing w:after="140"/>
+      </w:pPr>
       <w:r>
         <w:rPr>
-          <w:rFonts w:ascii="Times New Roman" w:hAnsi="Times New Roman" w:eastAsia="Times New Roman" w:cs="Times New Roman"/>
+          <w:i/>
+          <w:color w:val="555555"/>
           <w:sz w:val="24"/>
           <w:szCs w:val="24"/>
-          <w:color w:val="000000"/>
+          <w:rFonts w:ascii="Times New Roman" w:hAnsi="Times New Roman" w:cs="Times New Roman" w:eastAsia="Times New Roman"/>
         </w:rPr>
-        <w:t>Если результат оформлен схемой или скриншотом, вставьте его в рамку. Если рисунок не требуется, удалите этот блок вместе с подписью.</w:t>
+        <w:t>Если схема помогает объяснить решение, вставьте её ниже. Иначе удалите этот блок вместе с подписью.</w:t>
       </w:r>
     </w:p>
     <w:tbl>
       <w:tblPr>
         <w:tblW w:type="auto" w:w="0"/>
+        <w:jc w:val="center"/>
         <w:tblLayout w:type="fixed"/>
         <w:tblLook w:firstColumn="1" w:firstRow="1" w:lastColumn="0" w:lastRow="0" w:noHBand="0" w:noVBand="1" w:val="04A0"/>
       </w:tblPr>
@@ -2670,325 +2895,20 @@
       </w:tblGrid>
       <w:tr>
         <w:trPr>
-          <w:trHeight w:val="2551" w:hRule="atLeast"/>
+          <w:cantSplit/>
+          <w:tblHeader/>
         </w:trPr>
         <w:tc>
           <w:tcPr>
             <w:tcW w:type="dxa" w:w="9354"/>
-            <w:tcBorders>
-              <w:top w:val="single" w:sz="4" w:color="D9D9D9"/>
-              <w:left w:val="single" w:sz="4" w:color="D9D9D9"/>
-              <w:bottom w:val="single" w:sz="4" w:color="D9D9D9"/>
-              <w:right w:val="single" w:sz="4" w:color="D9D9D9"/>
-            </w:tcBorders>
-            <w:shd w:fill="E7E6E6"/>
-          </w:tcPr>
-          <w:p>
-            <w:pPr>
-              <w:jc w:val="center"/>
-            </w:pPr>
-            <w:r>
-              <w:rPr>
-                <w:b/>
-                <w:rFonts w:ascii="Times New Roman" w:hAnsi="Times New Roman" w:eastAsia="Times New Roman" w:cs="Times New Roman"/>
-                <w:sz w:val="24"/>
-                <w:szCs w:val="24"/>
-                <w:color w:val="000000"/>
-              </w:rPr>
-              <w:t>Вставьте рисунок самостоятельно</w:t>
-            </w:r>
-          </w:p>
-        </w:tc>
-      </w:tr>
-    </w:tbl>
-    <w:p>
-      <w:pPr>
-        <w:jc w:val="center"/>
-      </w:pPr>
-      <w:r>
-        <w:rPr>
-          <w:rFonts w:ascii="Times New Roman" w:hAnsi="Times New Roman" w:eastAsia="Times New Roman" w:cs="Times New Roman"/>
-          <w:sz w:val="24"/>
-          <w:szCs w:val="24"/>
-          <w:color w:val="000000"/>
-        </w:rPr>
-        <w:t>Рисунок № — Название</w:t>
-      </w:r>
-    </w:p>
-    <w:p>
-      <w:pPr>
-        <w:jc w:val="center"/>
-      </w:pPr>
-      <w:r>
-        <w:rPr>
-          <w:i/>
-          <w:rFonts w:ascii="Times New Roman" w:hAnsi="Times New Roman" w:eastAsia="Times New Roman" w:cs="Times New Roman"/>
-          <w:sz w:val="24"/>
-          <w:szCs w:val="24"/>
-          <w:color w:val="000000"/>
-        </w:rPr>
-        <w:t>Впишите номер и название рисунка самостоятельно.</w:t>
-      </w:r>
-    </w:p>
-    <w:p>
-      <w:r>
-        <w:rPr>
-          <w:rFonts w:ascii="Times New Roman" w:hAnsi="Times New Roman" w:eastAsia="Times New Roman" w:cs="Times New Roman"/>
-          <w:sz w:val="24"/>
-          <w:szCs w:val="24"/>
-          <w:color w:val="000000"/>
-        </w:rPr>
-        <w:br w:type="page"/>
-      </w:r>
-    </w:p>
-    <w:p>
-      <w:pPr>
-        <w:pStyle w:val="1"/>
-        <w:keepNext/>
-      </w:pPr>
-      <w:r>
-        <w:rPr>
-          <w:rFonts w:ascii="Times New Roman" w:hAnsi="Times New Roman" w:eastAsia="Times New Roman" w:cs="Times New Roman"/>
-          <w:sz w:val="24"/>
-          <w:szCs w:val="24"/>
-          <w:b/>
-          <w:color w:val="000000"/>
-        </w:rPr>
-        <w:t>Решение, обоснование и проверка</w:t>
-      </w:r>
-    </w:p>
-    <w:p>
-      <w:pPr>
-        <w:pStyle w:val="2"/>
-        <w:keepNext/>
-      </w:pPr>
-      <w:r>
-        <w:rPr>
-          <w:rFonts w:ascii="Times New Roman" w:hAnsi="Times New Roman" w:eastAsia="Times New Roman" w:cs="Times New Roman"/>
-          <w:sz w:val="24"/>
-          <w:szCs w:val="24"/>
-          <w:b/>
-          <w:color w:val="000000"/>
-        </w:rPr>
-        <w:t>Принятое решение</w:t>
-      </w:r>
-    </w:p>
-    <w:p>
-      <w:r>
-        <w:rPr>
-          <w:rFonts w:ascii="Times New Roman" w:hAnsi="Times New Roman" w:eastAsia="Times New Roman" w:cs="Times New Roman"/>
-          <w:sz w:val="24"/>
-          <w:szCs w:val="24"/>
-          <w:color w:val="000000"/>
-        </w:rPr>
-        <w:t>[Заполните самостоятельно.]</w:t>
-        <w:br/>
-        <w:t>________________________________________________________</w:t>
-      </w:r>
-    </w:p>
-    <w:p>
-      <w:pPr>
-        <w:pStyle w:val="2"/>
-        <w:keepNext/>
-      </w:pPr>
-      <w:r>
-        <w:rPr>
-          <w:rFonts w:ascii="Times New Roman" w:hAnsi="Times New Roman" w:eastAsia="Times New Roman" w:cs="Times New Roman"/>
-          <w:sz w:val="24"/>
-          <w:szCs w:val="24"/>
-          <w:b/>
-          <w:color w:val="000000"/>
-        </w:rPr>
-        <w:t>Факты и источники для обоснования</w:t>
-      </w:r>
-    </w:p>
-    <w:p>
-      <w:r>
-        <w:rPr>
-          <w:rFonts w:ascii="Times New Roman" w:hAnsi="Times New Roman" w:eastAsia="Times New Roman" w:cs="Times New Roman"/>
-          <w:sz w:val="24"/>
-          <w:szCs w:val="24"/>
-          <w:color w:val="000000"/>
-        </w:rPr>
-        <w:t>[Заполните самостоятельно.]</w:t>
-        <w:br/>
-        <w:t>________________________________________________________</w:t>
-      </w:r>
-    </w:p>
-    <w:p>
-      <w:pPr>
-        <w:pStyle w:val="2"/>
-        <w:keepNext/>
-      </w:pPr>
-      <w:r>
-        <w:rPr>
-          <w:rFonts w:ascii="Times New Roman" w:hAnsi="Times New Roman" w:eastAsia="Times New Roman" w:cs="Times New Roman"/>
-          <w:sz w:val="24"/>
-          <w:szCs w:val="24"/>
-          <w:b/>
-          <w:color w:val="000000"/>
-        </w:rPr>
-        <w:t>Проверка результата</w:t>
-      </w:r>
-    </w:p>
-    <w:p>
-      <w:r>
-        <w:rPr>
-          <w:rFonts w:ascii="Times New Roman" w:hAnsi="Times New Roman" w:eastAsia="Times New Roman" w:cs="Times New Roman"/>
-          <w:sz w:val="24"/>
-          <w:szCs w:val="24"/>
-          <w:color w:val="000000"/>
-        </w:rPr>
-        <w:t>[Заполните самостоятельно.]</w:t>
-        <w:br/>
-        <w:t>________________________________________________________</w:t>
-      </w:r>
-    </w:p>
-    <w:p>
-      <w:pPr>
-        <w:pStyle w:val="2"/>
-        <w:keepNext/>
-      </w:pPr>
-      <w:r>
-        <w:rPr>
-          <w:rFonts w:ascii="Times New Roman" w:hAnsi="Times New Roman" w:eastAsia="Times New Roman" w:cs="Times New Roman"/>
-          <w:sz w:val="24"/>
-          <w:szCs w:val="24"/>
-          <w:b/>
-          <w:color w:val="000000"/>
-        </w:rPr>
-        <w:t>Вывод и данные для следующей работы</w:t>
-      </w:r>
-    </w:p>
-    <w:p>
-      <w:r>
-        <w:rPr>
-          <w:rFonts w:ascii="Times New Roman" w:hAnsi="Times New Roman" w:eastAsia="Times New Roman" w:cs="Times New Roman"/>
-          <w:sz w:val="24"/>
-          <w:szCs w:val="24"/>
-          <w:color w:val="000000"/>
-        </w:rPr>
-        <w:t>[Заполните самостоятельно.]</w:t>
-        <w:br/>
-        <w:t>________________________________________________________</w:t>
-      </w:r>
-    </w:p>
-    <w:p>
-      <w:pPr>
-        <w:pStyle w:val="2"/>
-        <w:keepNext/>
-      </w:pPr>
-      <w:r>
-        <w:rPr>
-          <w:rFonts w:ascii="Times New Roman" w:hAnsi="Times New Roman" w:eastAsia="Times New Roman" w:cs="Times New Roman"/>
-          <w:sz w:val="24"/>
-          <w:szCs w:val="24"/>
-          <w:b/>
-          <w:color w:val="000000"/>
-        </w:rPr>
-        <w:t>Использование инструментов</w:t>
-      </w:r>
-    </w:p>
-    <w:p>
-      <w:r>
-        <w:rPr>
-          <w:rFonts w:ascii="Times New Roman" w:hAnsi="Times New Roman" w:eastAsia="Times New Roman" w:cs="Times New Roman"/>
-          <w:sz w:val="24"/>
-          <w:szCs w:val="24"/>
-          <w:color w:val="000000"/>
-        </w:rPr>
-        <w:t>Заполняется при использовании внешних инструментов. Укажите выполненную операцию и то, что проверили самостоятельно.</w:t>
-      </w:r>
-    </w:p>
-    <w:tbl>
-      <w:tblPr>
-        <w:tblW w:type="auto" w:w="0"/>
-        <w:tblLayout w:type="fixed"/>
-        <w:tblLook w:firstColumn="1" w:firstRow="1" w:lastColumn="0" w:lastRow="0" w:noHBand="0" w:noVBand="1" w:val="04A0"/>
-      </w:tblPr>
-      <w:tblGrid>
-        <w:gridCol w:w="2268"/>
-        <w:gridCol w:w="3402"/>
-        <w:gridCol w:w="3685"/>
-      </w:tblGrid>
-      <w:tr>
-        <w:tc>
-          <w:tcPr>
-            <w:tcW w:type="dxa" w:w="2268"/>
-            <w:tcBorders>
-              <w:top w:val="single" w:sz="4" w:color="D9D9D9"/>
-              <w:left w:val="single" w:sz="4" w:color="D9D9D9"/>
-              <w:bottom w:val="single" w:sz="4" w:color="D9D9D9"/>
-              <w:right w:val="single" w:sz="4" w:color="D9D9D9"/>
-            </w:tcBorders>
-            <w:shd w:fill="E7E6E6"/>
-          </w:tcPr>
-          <w:p>
-            <w:r>
-              <w:rPr>
-                <w:b/>
-                <w:rFonts w:ascii="Times New Roman" w:hAnsi="Times New Roman" w:eastAsia="Times New Roman" w:cs="Times New Roman"/>
-                <w:sz w:val="24"/>
-                <w:szCs w:val="24"/>
-                <w:color w:val="000000"/>
-              </w:rPr>
-              <w:t>Инструмент</w:t>
-            </w:r>
-          </w:p>
-        </w:tc>
-        <w:tc>
-          <w:tcPr>
-            <w:tcW w:type="dxa" w:w="3402"/>
-            <w:tcBorders>
-              <w:top w:val="single" w:sz="4" w:color="D9D9D9"/>
-              <w:left w:val="single" w:sz="4" w:color="D9D9D9"/>
-              <w:bottom w:val="single" w:sz="4" w:color="D9D9D9"/>
-              <w:right w:val="single" w:sz="4" w:color="D9D9D9"/>
-            </w:tcBorders>
-            <w:shd w:fill="E7E6E6"/>
-          </w:tcPr>
-          <w:p>
-            <w:r>
-              <w:rPr>
-                <w:b/>
-                <w:rFonts w:ascii="Times New Roman" w:hAnsi="Times New Roman" w:eastAsia="Times New Roman" w:cs="Times New Roman"/>
-                <w:sz w:val="24"/>
-                <w:szCs w:val="24"/>
-                <w:color w:val="000000"/>
-              </w:rPr>
-              <w:t>Операция</w:t>
-            </w:r>
-          </w:p>
-        </w:tc>
-        <w:tc>
-          <w:tcPr>
-            <w:tcW w:type="dxa" w:w="3685"/>
-            <w:tcBorders>
-              <w:top w:val="single" w:sz="4" w:color="D9D9D9"/>
-              <w:left w:val="single" w:sz="4" w:color="D9D9D9"/>
-              <w:bottom w:val="single" w:sz="4" w:color="D9D9D9"/>
-              <w:right w:val="single" w:sz="4" w:color="D9D9D9"/>
-            </w:tcBorders>
-            <w:shd w:fill="E7E6E6"/>
-          </w:tcPr>
-          <w:p>
-            <w:r>
-              <w:rPr>
-                <w:b/>
-                <w:rFonts w:ascii="Times New Roman" w:hAnsi="Times New Roman" w:eastAsia="Times New Roman" w:cs="Times New Roman"/>
-                <w:sz w:val="24"/>
-                <w:szCs w:val="24"/>
-                <w:color w:val="000000"/>
-              </w:rPr>
-              <w:t>Самостоятельная проверка</w:t>
-            </w:r>
-          </w:p>
-        </w:tc>
-      </w:tr>
-      <w:tr>
-        <w:tc>
-          <w:tcPr>
-            <w:tcW w:type="dxa" w:w="2268"/>
+            <w:vAlign w:val="center"/>
+            <w:shd w:fill="E7EDF5"/>
+            <w:tcMar>
+              <w:top w:w="100" w:type="dxa"/>
+              <w:left w:w="100" w:type="dxa"/>
+              <w:bottom w:w="100" w:type="dxa"/>
+              <w:right w:w="100" w:type="dxa"/>
+            </w:tcMar>
             <w:tcBorders>
               <w:top w:val="single" w:sz="4" w:color="D9D9D9"/>
               <w:left w:val="single" w:sz="4" w:color="D9D9D9"/>
@@ -2997,19 +2917,36 @@
             </w:tcBorders>
           </w:tcPr>
           <w:p>
+            <w:pPr>
+              <w:spacing w:after="80" w:before="80"/>
+            </w:pPr>
             <w:r>
               <w:rPr>
-                <w:rFonts w:ascii="Times New Roman" w:hAnsi="Times New Roman" w:eastAsia="Times New Roman" w:cs="Times New Roman"/>
+                <w:b/>
                 <w:sz w:val="24"/>
                 <w:szCs w:val="24"/>
-                <w:color w:val="000000"/>
+                <w:rFonts w:ascii="Times New Roman" w:hAnsi="Times New Roman" w:cs="Times New Roman" w:eastAsia="Times New Roman"/>
               </w:rPr>
+              <w:t>Место для схемы</w:t>
             </w:r>
           </w:p>
         </w:tc>
+      </w:tr>
+      <w:tr>
+        <w:trPr>
+          <w:cantSplit/>
+        </w:trPr>
         <w:tc>
           <w:tcPr>
-            <w:tcW w:type="dxa" w:w="3402"/>
+            <w:tcW w:type="dxa" w:w="9354"/>
+            <w:vAlign w:val="center"/>
+            <w:shd w:fill="FFFFFF"/>
+            <w:tcMar>
+              <w:top w:w="100" w:type="dxa"/>
+              <w:left w:w="100" w:type="dxa"/>
+              <w:bottom w:w="100" w:type="dxa"/>
+              <w:right w:w="100" w:type="dxa"/>
+            </w:tcMar>
             <w:tcBorders>
               <w:top w:val="single" w:sz="4" w:color="D9D9D9"/>
               <w:left w:val="single" w:sz="4" w:color="D9D9D9"/>
@@ -3018,104 +2955,99 @@
             </w:tcBorders>
           </w:tcPr>
           <w:p>
+            <w:pPr>
+              <w:spacing w:after="80" w:before="80"/>
+            </w:pPr>
             <w:r>
               <w:rPr>
-                <w:rFonts w:ascii="Times New Roman" w:hAnsi="Times New Roman" w:eastAsia="Times New Roman" w:cs="Times New Roman"/>
+                <w:b w:val="0"/>
                 <w:sz w:val="24"/>
                 <w:szCs w:val="24"/>
-                <w:color w:val="000000"/>
+                <w:rFonts w:ascii="Times New Roman" w:hAnsi="Times New Roman" w:cs="Times New Roman" w:eastAsia="Times New Roman"/>
               </w:rPr>
-            </w:r>
-          </w:p>
-        </w:tc>
-        <w:tc>
-          <w:tcPr>
-            <w:tcW w:type="dxa" w:w="3685"/>
-            <w:tcBorders>
-              <w:top w:val="single" w:sz="4" w:color="D9D9D9"/>
-              <w:left w:val="single" w:sz="4" w:color="D9D9D9"/>
-              <w:bottom w:val="single" w:sz="4" w:color="D9D9D9"/>
-              <w:right w:val="single" w:sz="4" w:color="D9D9D9"/>
-            </w:tcBorders>
-          </w:tcPr>
-          <w:p>
-            <w:r>
-              <w:rPr>
-                <w:rFonts w:ascii="Times New Roman" w:hAnsi="Times New Roman" w:eastAsia="Times New Roman" w:cs="Times New Roman"/>
-                <w:sz w:val="24"/>
-                <w:szCs w:val="24"/>
-                <w:color w:val="000000"/>
-              </w:rPr>
-            </w:r>
-          </w:p>
-        </w:tc>
-      </w:tr>
-      <w:tr>
-        <w:tc>
-          <w:tcPr>
-            <w:tcW w:type="dxa" w:w="2268"/>
-            <w:tcBorders>
-              <w:top w:val="single" w:sz="4" w:color="D9D9D9"/>
-              <w:left w:val="single" w:sz="4" w:color="D9D9D9"/>
-              <w:bottom w:val="single" w:sz="4" w:color="D9D9D9"/>
-              <w:right w:val="single" w:sz="4" w:color="D9D9D9"/>
-            </w:tcBorders>
-          </w:tcPr>
-          <w:p>
-            <w:r>
-              <w:rPr>
-                <w:rFonts w:ascii="Times New Roman" w:hAnsi="Times New Roman" w:eastAsia="Times New Roman" w:cs="Times New Roman"/>
-                <w:sz w:val="24"/>
-                <w:szCs w:val="24"/>
-                <w:color w:val="000000"/>
-              </w:rPr>
-            </w:r>
-          </w:p>
-        </w:tc>
-        <w:tc>
-          <w:tcPr>
-            <w:tcW w:type="dxa" w:w="3402"/>
-            <w:tcBorders>
-              <w:top w:val="single" w:sz="4" w:color="D9D9D9"/>
-              <w:left w:val="single" w:sz="4" w:color="D9D9D9"/>
-              <w:bottom w:val="single" w:sz="4" w:color="D9D9D9"/>
-              <w:right w:val="single" w:sz="4" w:color="D9D9D9"/>
-            </w:tcBorders>
-          </w:tcPr>
-          <w:p>
-            <w:r>
-              <w:rPr>
-                <w:rFonts w:ascii="Times New Roman" w:hAnsi="Times New Roman" w:eastAsia="Times New Roman" w:cs="Times New Roman"/>
-                <w:sz w:val="24"/>
-                <w:szCs w:val="24"/>
-                <w:color w:val="000000"/>
-              </w:rPr>
-            </w:r>
-          </w:p>
-        </w:tc>
-        <w:tc>
-          <w:tcPr>
-            <w:tcW w:type="dxa" w:w="3685"/>
-            <w:tcBorders>
-              <w:top w:val="single" w:sz="4" w:color="D9D9D9"/>
-              <w:left w:val="single" w:sz="4" w:color="D9D9D9"/>
-              <w:bottom w:val="single" w:sz="4" w:color="D9D9D9"/>
-              <w:right w:val="single" w:sz="4" w:color="D9D9D9"/>
-            </w:tcBorders>
-          </w:tcPr>
-          <w:p>
-            <w:r>
-              <w:rPr>
-                <w:rFonts w:ascii="Times New Roman" w:hAnsi="Times New Roman" w:eastAsia="Times New Roman" w:cs="Times New Roman"/>
-                <w:sz w:val="24"/>
-                <w:szCs w:val="24"/>
-                <w:color w:val="000000"/>
-              </w:rPr>
+              <w:br/>
+              <w:br/>
             </w:r>
           </w:p>
         </w:tc>
       </w:tr>
     </w:tbl>
+    <w:p>
+      <w:pPr>
+        <w:spacing w:after="140"/>
+      </w:pPr>
+    </w:p>
+    <w:p>
+      <w:pPr>
+        <w:spacing w:after="140"/>
+        <w:jc w:val="center"/>
+      </w:pPr>
+      <w:r>
+        <w:rPr>
+          <w:sz w:val="24"/>
+          <w:szCs w:val="24"/>
+          <w:rFonts w:ascii="Times New Roman" w:hAnsi="Times New Roman" w:cs="Times New Roman" w:eastAsia="Times New Roman"/>
+        </w:rPr>
+        <w:t>Рисунок № — Название</w:t>
+      </w:r>
+    </w:p>
+    <w:p>
+      <w:pPr>
+        <w:spacing w:after="140"/>
+      </w:pPr>
+      <w:r>
+        <w:rPr>
+          <w:i/>
+          <w:color w:val="555555"/>
+          <w:sz w:val="24"/>
+          <w:szCs w:val="24"/>
+          <w:rFonts w:ascii="Times New Roman" w:hAnsi="Times New Roman" w:cs="Times New Roman" w:eastAsia="Times New Roman"/>
+        </w:rPr>
+        <w:t>Впишите номер и название рисунка самостоятельно.</w:t>
+      </w:r>
+    </w:p>
+    <w:p>
+      <w:pPr>
+        <w:pStyle w:val="1"/>
+        <w:spacing w:after="140"/>
+      </w:pPr>
+      <w:r>
+        <w:rPr>
+          <w:sz w:val="24"/>
+          <w:szCs w:val="24"/>
+          <w:rFonts w:ascii="Times New Roman" w:hAnsi="Times New Roman" w:cs="Times New Roman" w:eastAsia="Times New Roman"/>
+        </w:rPr>
+        <w:t>Оформление результата</w:t>
+      </w:r>
+    </w:p>
+    <w:p>
+      <w:pPr>
+        <w:spacing w:after="140"/>
+      </w:pPr>
+      <w:r>
+        <w:rPr>
+          <w:sz w:val="24"/>
+          <w:szCs w:val="24"/>
+          <w:rFonts w:ascii="Times New Roman" w:hAnsi="Times New Roman" w:cs="Times New Roman" w:eastAsia="Times New Roman"/>
+        </w:rPr>
+        <w:t>Имя файла: ЛР01_Вариант_Фамилия.docx</w:t>
+      </w:r>
+    </w:p>
+    <w:p>
+      <w:pPr>
+        <w:spacing w:after="140"/>
+      </w:pPr>
+      <w:r>
+        <w:rPr>
+          <w:i/>
+          <w:color w:val="555555"/>
+          <w:sz w:val="24"/>
+          <w:szCs w:val="24"/>
+          <w:rFonts w:ascii="Times New Roman" w:hAnsi="Times New Roman" w:cs="Times New Roman" w:eastAsia="Times New Roman"/>
+        </w:rPr>
+        <w:t>В имени файла замените «Вариант» своим кодом, а «Фамилия» своей фамилией. Передайте DOCX способом, указанным преподавателем.</w:t>
+      </w:r>
+    </w:p>
     <w:sectPr>
       <w:pgSz w:w="11906" w:h="16838"/>
       <w:pgMar w:top="1134" w:right="850" w:bottom="1134" w:left="1701" w:header="708" w:footer="708" w:gutter="0"/>
@@ -3601,7 +3533,7 @@
     <w:name w:val="Normal"/>
     <w:qFormat/>
     <w:pPr>
-      <w:spacing w:after="100"/>
+      <w:spacing w:after="100" w:line="264" w:lineRule="auto"/>
     </w:pPr>
     <w:rPr>
       <w:rFonts w:ascii="Times New Roman" w:eastAsia="Calibri" w:hAnsi="Times New Roman" w:cs="Times New Roman"/>
@@ -3619,7 +3551,7 @@
     <w:pPr>
       <w:keepNext/>
       <w:keepLines/>
-      <w:spacing w:before="240"/>
+      <w:spacing w:before="200" w:line="264" w:lineRule="auto"/>
       <w:outlineLvl w:val="0"/>
     </w:pPr>
     <w:rPr>
@@ -3641,7 +3573,7 @@
     <w:pPr>
       <w:keepNext/>
       <w:keepLines/>
-      <w:spacing w:before="160" w:after="60"/>
+      <w:spacing w:before="200" w:after="60" w:line="264" w:lineRule="auto"/>
       <w:outlineLvl w:val="1"/>
     </w:pPr>
     <w:rPr>
@@ -4005,7 +3937,7 @@
     <w:qFormat/>
     <w:pPr>
       <w:keepNext/>
-      <w:spacing w:after="160"/>
+      <w:spacing w:after="160" w:line="264" w:lineRule="auto"/>
       <w:contextualSpacing/>
     </w:pPr>
     <w:rPr>

</xml_diff>